<commit_message>
Restore text ranges and update step-by-step guide with answers
</commit_message>
<xml_diff>
--- a/Jamovi_Answers_and_Step_by_Step_Guide.docx
+++ b/Jamovi_Answers_and_Step_by_Step_Guide.docx
@@ -27,7 +27,7 @@
         </w:rPr>
         <w:t>Complete Official Solutions, Professor-Approved Answer Tables, Verbal &amp; Hypothesis Interpretations,</w:t>
         <w:br/>
-        <w:t>and Detailed Jamovi Procedures for Every Problem</w:t>
+        <w:t>and Detailed Jamovi Procedures with Text Ranges &amp; Numerical Codes</w:t>
       </w:r>
     </w:p>
     <w:p>
@@ -50,7 +50,7 @@
         <w:rPr>
           <w:sz w:val="20"/>
         </w:rPr>
-        <w:t>All verbal interpretations and hypothesis decisions in this document strictly follow the official guidelines provided by Ms. Lugo (from jamovi-reviewer.docx and seatwork documents).</w:t>
+        <w:t>All verbal interpretations, correlation strength thresholds, and hypothesis decisions in this document strictly follow the official guidelines provided by Ms. Lugo (from jamovi-reviewer.docx and seatwork documents).</w:t>
       </w:r>
     </w:p>
     <w:p>
@@ -769,6 +769,8 @@
         <w:br/>
         <w:br/>
         <w:t>Dataset Tab to Use: Prob1_Water_Health_Demog in Jamovi_Seatwork_Practice_Data.xlsx (N = 150 respondents)</w:t>
+        <w:br/>
+        <w:t>• Includes text ranges: Age_Bracket ('15-24 y/o', '25-39 y/o'...), Gender ('Male', 'Female'), Educational_Attainment ('Elementary', 'High school'...), Monthly_Household_Income ('≤ ₱ 40,000'...), and numerical codes.</w:t>
       </w:r>
     </w:p>
     <w:p>
@@ -791,51 +793,47 @@
         <w:rPr>
           <w:sz w:val="19"/>
         </w:rPr>
-        <w:t>Step 1: Open Data &amp; Configure Variables in Jamovi</w:t>
+        <w:t>Step 1: Open Data &amp; Check Column Types in Jamovi</w:t>
         <w:br/>
-        <w:t>• In Jamovi, click the top-left menu icon (☰) -&gt; Open -&gt; Browse -&gt; select Jamovi_Seatwork_Practice_Data.xlsx -&gt; choose sheet Prob1_Water_Health_Demog.</w:t>
+        <w:t>• In Jamovi: Click Menu (☰) -&gt; Open -&gt; Browse -&gt; select Jamovi_Seatwork_Practice_Data.xlsx -&gt; open sheet Prob1_Water_Health_Demog.</w:t>
         <w:br/>
-        <w:t>• In the Data tab, double-click each column header to verify the Measure Type:</w:t>
+        <w:t>• Notice that both text range columns (e.g. Age_Bracket, Gender, Educational_Attainment, Monthly_Household_Income) and numeric codes (Age_Code, Gender_Code, etc.) are available.</w:t>
         <w:br/>
-        <w:t xml:space="preserve">  - Respondent_ID: Nominal (or ID)</w:t>
-        <w:br/>
-        <w:t xml:space="preserve">  - Age: Ordinal (Levels: 1 = 15-24 y/o, 2 = 25-39 y/o, 3 = 40-64 y/o, 4 = ≥ 65 y/o)</w:t>
-        <w:br/>
-        <w:t xml:space="preserve">  - Gender: Nominal (Levels: 1 = Male, 2 = Female)</w:t>
-        <w:br/>
-        <w:t xml:space="preserve">  - Educational_Attainment: Ordinal (Levels: 1 = Elementary, 2 = High school, 3 = College, 4 = Others)</w:t>
-        <w:br/>
-        <w:t xml:space="preserve">  - Monthly_Income: Ordinal (Levels: 1 = ≤ ₱40,000, 2 = ₱41,000-59,999, 3 = ≥ ₱60,000)</w:t>
-        <w:br/>
-        <w:t xml:space="preserve">  - Health_Sanitation_Status: Continuous (123 icon)</w:t>
-        <w:br/>
-        <w:t xml:space="preserve">  - Water_Supply_Status: Continuous (123 icon)</w:t>
+        <w:t>• Ensure Health_Sanitation_Status and Water_Supply_Status have their Measure Type set to Continuous (123).</w:t>
         <w:br/>
         <w:br/>
         <w:t>Step 2: Generate Demographic Frequency Tables (Question 1)</w:t>
         <w:br/>
         <w:t>• Top menu: Analyses -&gt; Exploration -&gt; Descriptives.</w:t>
         <w:br/>
-        <w:t>• Move Age, Gender, Educational_Attainment, and Monthly_Income into the Variables box on the right.</w:t>
+        <w:t>• Move the text range columns into Variables:</w:t>
         <w:br/>
-        <w:t>• Click Statistics dropdown below -&gt; check Frequency tables.</w:t>
+        <w:t xml:space="preserve">  - Age_Bracket (displays 15-24 y/o, 25-39 y/o, etc.)</w:t>
+        <w:br/>
+        <w:t xml:space="preserve">  - Gender (displays Male, Female)</w:t>
+        <w:br/>
+        <w:t xml:space="preserve">  - Educational_Attainment (displays Elementary, High school, College, Others)</w:t>
+        <w:br/>
+        <w:t xml:space="preserve">  - Monthly_Household_Income (displays ≤ ₱ 40,000, ₱ 41,000 - 59,999, ₱ 60,000 ≤)</w:t>
+        <w:br/>
+        <w:t>• Under Statistics, check Frequency tables.</w:t>
         <w:br/>
         <w:br/>
-        <w:t>Step 3: Test Demographic Profile vs Health Status (Question 2 - Kruskal-Wallis &amp; Mann-Whitney)</w:t>
+        <w:t>Step 3: Test Demographic Profile vs Health Status (Question 2 - Kruskal-Wallis &amp; Mann-Whitney U)</w:t>
         <w:br/>
-        <w:t>• For Age, Education, and Income (3+ groups):</w:t>
+        <w:t>• Kruskal-Wallis for Age, Education, and Income (3+ groups):</w:t>
         <w:br/>
         <w:t xml:space="preserve">  1. Top menu: Analyses -&gt; ANOVA -&gt; One-Way ANOVA.</w:t>
         <w:br/>
         <w:t xml:space="preserve">  2. Drag Health_Sanitation_Status into Dependent Variable.</w:t>
         <w:br/>
-        <w:t xml:space="preserve">  3. Drag Age into Grouping Variable.</w:t>
+        <w:t xml:space="preserve">  3. Drag Age_Bracket (or Age_Code) into Grouping Variable.</w:t>
         <w:br/>
-        <w:t xml:space="preserve">  4. Under Variances, select Kruskal-Wallis.</w:t>
+        <w:t xml:space="preserve">  4. Under Variances, check Kruskal-Wallis.</w:t>
         <w:br/>
-        <w:t xml:space="preserve">  5. Note the χ², df, and p-value. Repeat by replacing Grouping Variable with Educational_Attainment, then Monthly_Income.</w:t>
+        <w:t xml:space="preserve">  5. Note the χ², df, and p-value. Repeat by replacing Grouping Variable with Educational_Attainment, then Monthly_Household_Income.</w:t>
         <w:br/>
-        <w:t>• For Gender (2 groups - Male vs Female):</w:t>
+        <w:t>• Mann-Whitney U for Gender (2 groups - Male vs Female):</w:t>
         <w:br/>
         <w:t xml:space="preserve">  1. Top menu: Analyses -&gt; T-Tests -&gt; Independent Samples T-Test.</w:t>
         <w:br/>
@@ -845,16 +843,16 @@
         <w:br/>
         <w:t xml:space="preserve">  4. Under Tests, check Mann-Whitney U.</w:t>
         <w:br/>
-        <w:t xml:space="preserve">  5. Under Hypothesis, ensure Two-sided (Hₐ: Group 1 ≠ Group 2) is selected.</w:t>
+        <w:t xml:space="preserve">  5. Under Hypothesis, ensure Two-sided (Group 1 ≠ Group 2) is checked.</w:t>
         <w:br/>
         <w:br/>
         <w:t>Step 4: Correlation: Health Status vs Water Supply Status (Question 3 - Spearman's rho)</w:t>
         <w:br/>
         <w:t>• Top menu: Analyses -&gt; Regression -&gt; Correlation Matrix.</w:t>
         <w:br/>
-        <w:t>• Move Health_Sanitation_Status and Water_Supply_Status into the right box.</w:t>
+        <w:t>• Move Health_Sanitation_Status and Water_Supply_Status into Variables box.</w:t>
         <w:br/>
-        <w:t>• Under Correlation Coefficients, uncheck Pearson and check Spearman.</w:t>
+        <w:t>• Under Correlation Coefficients, check Spearman (uncheck Pearson).</w:t>
         <w:br/>
         <w:t>• Under Hypothesis, select Correlated (two-tailed test).</w:t>
         <w:br/>
@@ -881,7 +879,7 @@
         <w:rPr>
           <w:b/>
         </w:rPr>
-        <w:t>Table 2.1: Demographic Profile of Respondents</w:t>
+        <w:t>Table 2.1: Demographic Profile of Respondents (With Text Ranges)</w:t>
       </w:r>
     </w:p>
     <w:tbl>
@@ -907,7 +905,7 @@
                 <w:b/>
                 <w:color w:val="FFFFFF"/>
               </w:rPr>
-              <w:t>Demographic Profile Indicator</w:t>
+              <w:t>Demographic Profile Indicator (Text Range)</w:t>
             </w:r>
           </w:p>
         </w:tc>
@@ -1019,7 +1017,7 @@
               <w:rPr>
                 <w:sz w:val="18"/>
               </w:rPr>
-              <w:t xml:space="preserve">  1 (15 - 24 years old)</w:t>
+              <w:t xml:space="preserve">  15 - 24 y/o (Code 1)</w:t>
             </w:r>
           </w:p>
         </w:tc>
@@ -1078,7 +1076,7 @@
               <w:rPr>
                 <w:sz w:val="18"/>
               </w:rPr>
-              <w:t xml:space="preserve">  2 (25 - 39 years old)</w:t>
+              <w:t xml:space="preserve">  25 - 39 y/o (Code 2)</w:t>
             </w:r>
           </w:p>
         </w:tc>
@@ -1137,7 +1135,7 @@
               <w:rPr>
                 <w:sz w:val="18"/>
               </w:rPr>
-              <w:t xml:space="preserve">  3 (40 - 64 years old)</w:t>
+              <w:t xml:space="preserve">  40 - 64 y/o (Code 3)</w:t>
             </w:r>
           </w:p>
         </w:tc>
@@ -1196,7 +1194,7 @@
               <w:rPr>
                 <w:sz w:val="18"/>
               </w:rPr>
-              <w:t xml:space="preserve">  4 (≥ 65 years old)</w:t>
+              <w:t xml:space="preserve">  ≥ 65 y/o (Code 4)</w:t>
             </w:r>
           </w:p>
         </w:tc>
@@ -1381,7 +1379,7 @@
               <w:rPr>
                 <w:sz w:val="18"/>
               </w:rPr>
-              <w:t xml:space="preserve">  Male (Code 1)</w:t>
+              <w:t xml:space="preserve">  Male</w:t>
             </w:r>
           </w:p>
         </w:tc>
@@ -1440,7 +1438,7 @@
               <w:rPr>
                 <w:sz w:val="18"/>
               </w:rPr>
-              <w:t xml:space="preserve">  Female (Code 2)</w:t>
+              <w:t xml:space="preserve">  Female</w:t>
             </w:r>
           </w:p>
         </w:tc>
@@ -1625,7 +1623,7 @@
               <w:rPr>
                 <w:sz w:val="18"/>
               </w:rPr>
-              <w:t xml:space="preserve">  Elementary (Code 1)</w:t>
+              <w:t xml:space="preserve">  Elementary</w:t>
             </w:r>
           </w:p>
         </w:tc>
@@ -1684,7 +1682,7 @@
               <w:rPr>
                 <w:sz w:val="18"/>
               </w:rPr>
-              <w:t xml:space="preserve">  High school (Code 2)</w:t>
+              <w:t xml:space="preserve">  High school</w:t>
             </w:r>
           </w:p>
         </w:tc>
@@ -1743,7 +1741,7 @@
               <w:rPr>
                 <w:sz w:val="18"/>
               </w:rPr>
-              <w:t xml:space="preserve">  College (Code 3)</w:t>
+              <w:t xml:space="preserve">  College</w:t>
             </w:r>
           </w:p>
         </w:tc>
@@ -1802,7 +1800,7 @@
               <w:rPr>
                 <w:sz w:val="18"/>
               </w:rPr>
-              <w:t xml:space="preserve">  Others (Code 4)</w:t>
+              <w:t xml:space="preserve">  Others</w:t>
             </w:r>
           </w:p>
         </w:tc>
@@ -1987,7 +1985,7 @@
               <w:rPr>
                 <w:sz w:val="18"/>
               </w:rPr>
-              <w:t xml:space="preserve">  ≤ ₱ 40,000 (Code 1)</w:t>
+              <w:t xml:space="preserve">  ≤ ₱ 40,000</w:t>
             </w:r>
           </w:p>
         </w:tc>
@@ -2046,7 +2044,7 @@
               <w:rPr>
                 <w:sz w:val="18"/>
               </w:rPr>
-              <w:t xml:space="preserve">  ₱ 41,000 - 59,999 (Code 2)</w:t>
+              <w:t xml:space="preserve">  ₱ 41,000 - 59,999</w:t>
             </w:r>
           </w:p>
         </w:tc>
@@ -2105,7 +2103,7 @@
               <w:rPr>
                 <w:sz w:val="18"/>
               </w:rPr>
-              <w:t xml:space="preserve">  ≥ ₱ 60,000 (Code 3)</w:t>
+              <w:t xml:space="preserve">  ₱ 60,000 ≤</w:t>
             </w:r>
           </w:p>
         </w:tc>
@@ -2254,7 +2252,7 @@
                 <w:b/>
                 <w:color w:val="FFFFFF"/>
               </w:rPr>
-              <w:t>Demographic Profile</w:t>
+              <w:t>Demographic Profile Factor</w:t>
             </w:r>
           </w:p>
         </w:tc>
@@ -2365,7 +2363,7 @@
               <w:rPr>
                 <w:sz w:val="17"/>
               </w:rPr>
-              <w:t>Age</w:t>
+              <w:t>Age (Age_Bracket)</w:t>
             </w:r>
           </w:p>
         </w:tc>
@@ -2773,7 +2771,7 @@
               <w:rPr>
                 <w:sz w:val="17"/>
               </w:rPr>
-              <w:t>Gender</w:t>
+              <w:t>Gender (Male vs Female)</w:t>
             </w:r>
           </w:p>
         </w:tc>
@@ -2902,7 +2900,7 @@
         </w:rPr>
         <w:t>Written Interpretation for Question 2:</w:t>
         <w:br/>
-        <w:t>The Kruskal-Wallis test revealed no statistically significant differences in health and sanitation status across Age groups (χ²(3) = 1.824, p = .610), Educational Attainment levels (χ²(3) = 5.795, p = .122), and Monthly Household Income brackets (χ²(2) = 0.670, p = .715), as all p-values exceed the .05 (and .001) threshold. Similarly, the Mann-Whitney U test indicated no significant difference between Male and Female respondents (U = 2782.000, p = .916). Consequently, the null hypothesis is accepted for all demographic factors. There is no significant relationship between the demographic profile and the health and sanitation status of the respondents.</w:t>
+        <w:t>The Kruskal-Wallis tests across Age brackets (χ²(3) = 1.824, p = .610), Educational Attainment levels (χ²(3) = 5.795, p = .122), and Monthly Household Income ranges (χ²(2) = 0.670, p = .715) all produced p-values greater than .05 (&gt; .001). Similarly, the Mann-Whitney U test comparing Male and Female residents (U = 2782.000, p = .916) showed no significant difference. Consequently, the null hypothesis is Accepted for all demographic characteristics. There is no significant relationship between the demographic profile and the health and sanitation status of the respondents.</w:t>
       </w:r>
     </w:p>
     <w:p>
@@ -3186,7 +3184,7 @@
         </w:rPr>
         <w:t>Written Interpretation for Question 3:</w:t>
         <w:br/>
-        <w:t>The Spearman rank-order correlation yielded a correlation coefficient rho of 0.294 with a p-value of &lt; .001 (df = 148). Based on Ms. Lugo's interpretation scale, rho = 0.294 denotes a negligible positive correlation. Because the p-value is less than .001 (&lt; .001), the result is statistically significant. Therefore, the null hypothesis is Rejected. There is a statistically significant positive relationship between poor water supply status and the health and sanitation status of residents in Barangay San Antonio, Sto. Tomas, Batangas.</w:t>
+        <w:t>The Spearman rank correlation test yielded a correlation coefficient rho of 0.294 with a p-value of &lt; .001 (df = 148). Following Ms. Lugo's official interpretation benchmarks, rho = 0.294 represents a negligible positive correlation. Because the p-value is less than .001 (&lt; .001), the relationship is statistically significant. Therefore, the null hypothesis is Rejected. There is a statistically significant positive relationship between poor water supply status and the health and sanitation status of the residents of Barangay San Antonio, Sto. Tomas, Batangas.</w:t>
       </w:r>
     </w:p>
     <w:p>
@@ -3209,9 +3207,7 @@
         <w:rPr>
           <w:sz w:val="19"/>
         </w:rPr>
-        <w:t>Statement of the Problem:</w:t>
-        <w:br/>
-        <w:t>Specifically, this research aims to answer the following objectives:</w:t>
+        <w:t>Statement of the Problem / Research Objectives:</w:t>
         <w:br/>
         <w:t>1. To assess the relationship between social media integration and a sustainable green lifestyle.</w:t>
         <w:br/>
@@ -3222,7 +3218,9 @@
         <w:t>4. To evaluate the impact of HEI value co-creation on sustainable green lifestyle adoption among college students.</w:t>
         <w:br/>
         <w:br/>
-        <w:t>Dataset Tab to Use: Prob2_SocialMedia_SGLA_HEI in Jamovi_Seatwork_Practice_Data.xlsx (N = 186 respondents)</w:t>
+        <w:t>Dataset Tab to Use: Prob2_SocialMedia_SGLA_HEI in Jamovi_Seatwork_Practice_Data.xlsx (N = 186 college students)</w:t>
+        <w:br/>
+        <w:t>• Includes text labels: Year_Level ('1st Year', '2nd Year'...), College_Department ('College of Computing &amp; IT'...), and continuous composite scores.</w:t>
       </w:r>
     </w:p>
     <w:p>
@@ -3247,9 +3245,9 @@
         </w:rPr>
         <w:t>Step 1: Open Data &amp; Verify Variables</w:t>
         <w:br/>
-        <w:t>• In Jamovi, open Jamovi_Seatwork_Practice_Data.xlsx -&gt; choose sheet Prob2_SocialMedia_SGLA_HEI.</w:t>
+        <w:t>• In Jamovi: Click Menu (☰) -&gt; Open -&gt; Browse -&gt; select Jamovi_Seatwork_Practice_Data.xlsx -&gt; choose sheet Prob2_SocialMedia_SGLA_HEI.</w:t>
         <w:br/>
-        <w:t>• Ensure the following columns have their Measure Type set to Continuous (123):</w:t>
+        <w:t>• Ensure the following columns have Measure Type set to Continuous (123):</w:t>
         <w:br/>
         <w:t xml:space="preserve">  - Social_Media_Integration</w:t>
         <w:br/>
@@ -3262,26 +3260,26 @@
         <w:br/>
         <w:t>• Top menu: Analyses -&gt; Regression -&gt; Correlation Matrix.</w:t>
         <w:br/>
-        <w:t>• Drag Social_Media_Integration, HEI_Value_CoCreation, and Sustainable_Green_Lifestyle into the Variables box.</w:t>
+        <w:t>• Move Social_Media_Integration, HEI_Value_CoCreation, and Sustainable_Green_Lifestyle into the Variables box.</w:t>
         <w:br/>
         <w:t>• Under Correlation Coefficients, check Pearson.</w:t>
         <w:br/>
         <w:t>• Under Hypothesis, select Correlated (two-tailed).</w:t>
         <w:br/>
-        <w:t>• Under Additional Results, check Report significance.</w:t>
+        <w:t>• Under Additional Results, check Report significance and Flag significant correlations.</w:t>
         <w:br/>
         <w:br/>
         <w:t>Step 3: Run Simple Linear Regression (Objective 4 - Impact of HEI on SGLA)</w:t>
         <w:br/>
         <w:t>• Top menu: Analyses -&gt; Regression -&gt; Linear Regression.</w:t>
         <w:br/>
-        <w:t>• Drag Sustainable_Green_Lifestyle into Dependent Variable.</w:t>
+        <w:t>• Move Sustainable_Green_Lifestyle into Dependent Variable.</w:t>
         <w:br/>
-        <w:t>• Drag HEI_Value_CoCreation into Covariates.</w:t>
+        <w:t>• Move HEI_Value_CoCreation into Covariates.</w:t>
         <w:br/>
         <w:t>• Click Model Fit dropdown tab -&gt; check R, R², and F test.</w:t>
         <w:br/>
-        <w:t>• Under Model Coefficients, ensure Estimates, Standard error, and p-value are displayed.</w:t>
+        <w:t>• Under Model Coefficients, verify Estimates, SE, t, and p are checked.</w:t>
       </w:r>
     </w:p>
     <w:p>
@@ -4439,9 +4437,9 @@
         </w:rPr>
         <w:t>Written Interpretation for Objective 4 (Linear Regression):</w:t>
         <w:br/>
-        <w:t>The linear regression model is statistically significant (F = 45.1, p &lt; .001). The multiple correlation coefficient R is 0.444, and the coefficient of determination R² is 0.197, indicating that 19.7% of the variance in sustainable green lifestyle adoption is explained by HEI value co-creation among college students.</w:t>
+        <w:t>The linear regression model is statistically significant (F = 45.1, p &lt; .001). The multiple correlation coefficient R is 0.444, and the coefficient of determination R² is 0.197, indicating that 19.7% of the total variance in sustainable green lifestyle adoption is directly accounted for by HEI value co-creation among college students.</w:t>
         <w:br/>
-        <w:t>The regression equation is: SGLA = 2.117 + 0.399 * (HEI Value Co-creation). For every one-unit increase in HEI value co-creation, sustainable green lifestyle adoption increases by 0.399 units on average (t = 6.71, p &lt; .001). Therefore, the null hypothesis of no impact is Rejected.</w:t>
+        <w:t>The unstandardized regression slope b = 0.399 (SE = 0.0594, t = 6.71, p &lt; .001) confirms that for every one-unit increase in HEI value co-creation, students' adoption of sustainable green lifestyles increases by 0.399 units on average. Therefore, the null hypothesis of no impact is Rejected.</w:t>
       </w:r>
     </w:p>
     <w:p>
@@ -4469,14 +4467,9 @@
         <w:t>Is there a significant difference in academic stress levels among college students across different academic programs?</w:t>
         <w:br/>
         <w:br/>
-        <w:t>Hypotheses:</w:t>
+        <w:t>Dataset Tab to Use: Prob3_OneWay_ANOVA in Jamovi_Seatwork_Practice_Data.xlsx (N = 120 students)</w:t>
         <w:br/>
-        <w:t>• H₀: There is no significant difference in mean academic stress scores across the four academic programs (μ₁ = μ₂ = μ₃ = μ₄).</w:t>
-        <w:br/>
-        <w:t>• Hₐ: At least one academic program has a significantly different mean academic stress score.</w:t>
-        <w:br/>
-        <w:br/>
-        <w:t>Dataset Tab to Use: Prob3_OneWay_ANOVA in Jamovi_Seatwork_Practice_Data.xlsx (N = 120 students: 30 Computing, 30 Engineering, 30 Business, 30 Arts)</w:t>
+        <w:t>• Includes text labels: Academic_Program ('Computing &amp; IT', 'Engineering', 'Business &amp; Accountancy', 'Arts &amp; Sciences'), Gender ('Male', 'Female'), and continuous Academic_Stress_Score.</w:t>
       </w:r>
     </w:p>
     <w:p>
@@ -4499,15 +4492,13 @@
         <w:rPr>
           <w:sz w:val="19"/>
         </w:rPr>
-        <w:t>Step 1: Open Tab &amp; Set Variables</w:t>
+        <w:t>Step 1: Open Tab &amp; Select Variables</w:t>
         <w:br/>
         <w:t>• In Jamovi, open sheet Prob3_OneWay_ANOVA.</w:t>
         <w:br/>
-        <w:t>• Double-click column header Academic_Program -&gt; Set Measure Type to Nominal.</w:t>
+        <w:t>• Notice Academic_Program is already labeled with the program names (Computing &amp; IT, Engineering, Business &amp; Accountancy, Arts &amp; Sciences).</w:t>
         <w:br/>
-        <w:t xml:space="preserve">  (Levels: 1 = Computing &amp; IT, 2 = Engineering, 3 = Business &amp; Accountancy, 4 = Arts &amp; Sciences).</w:t>
-        <w:br/>
-        <w:t>• Double-click column header Academic_Stress_Score -&gt; Set Measure Type to Continuous (123).</w:t>
+        <w:t>• Ensure Academic_Stress_Score is set to Continuous (123).</w:t>
         <w:br/>
         <w:br/>
         <w:t>Step 2: Run One-Way ANOVA</w:t>
@@ -4520,7 +4511,7 @@
         <w:br/>
         <w:t>• Under Variances, check Assume equal (Fisher's) and Don't assume equal (Welch's).</w:t>
         <w:br/>
-        <w:t>• Under Additional Results, check Descriptives (to display N, Mean, and SD per group).</w:t>
+        <w:t>• Under Additional Results, check Descriptives (shows N, Mean, SD per program).</w:t>
         <w:br/>
         <w:t>• Under Post Hoc Tests, check Tukey.</w:t>
       </w:r>
@@ -4545,7 +4536,7 @@
         <w:rPr>
           <w:b/>
         </w:rPr>
-        <w:t>Table 4.1: One-Way ANOVA Results and Group Descriptives</w:t>
+        <w:t>Table 4.1: One-Way ANOVA Results and Program Means</w:t>
       </w:r>
     </w:p>
     <w:tbl>
@@ -4574,7 +4565,7 @@
                 <w:b/>
                 <w:color w:val="FFFFFF"/>
               </w:rPr>
-              <w:t>Academic Program</w:t>
+              <w:t>Academic Program (Text Label)</w:t>
             </w:r>
           </w:p>
         </w:tc>
@@ -4670,7 +4661,7 @@
               <w:rPr>
                 <w:sz w:val="18"/>
               </w:rPr>
-              <w:t>1 - Computing &amp; IT</w:t>
+              <w:t>Computing &amp; IT</w:t>
             </w:r>
           </w:p>
         </w:tc>
@@ -4786,7 +4777,7 @@
               <w:rPr>
                 <w:sz w:val="18"/>
               </w:rPr>
-              <w:t>2 - Engineering</w:t>
+              <w:t>Engineering</w:t>
             </w:r>
           </w:p>
         </w:tc>
@@ -4902,7 +4893,7 @@
               <w:rPr>
                 <w:sz w:val="18"/>
               </w:rPr>
-              <w:t>3 - Business &amp; Accountancy</w:t>
+              <w:t>Business &amp; Accountancy</w:t>
             </w:r>
           </w:p>
         </w:tc>
@@ -5016,7 +5007,7 @@
               <w:rPr>
                 <w:sz w:val="18"/>
               </w:rPr>
-              <w:t>4 - Arts &amp; Sciences</w:t>
+              <w:t>Arts &amp; Sciences</w:t>
             </w:r>
           </w:p>
         </w:tc>
@@ -5943,9 +5934,9 @@
         </w:rPr>
         <w:t>Written Interpretation for One-Way ANOVA:</w:t>
         <w:br/>
-        <w:t>The One-Way ANOVA revealed a statistically significant difference in academic stress scores across the four academic programs, F(3, 116) = 68.59, p &lt; .001. Therefore, the null hypothesis is Rejected. Engineering students reported the highest mean stress score (M = 83.5, SD = 7.8), followed by Computing &amp; IT (M = 76.0, SD = 7.5), Business &amp; Accountancy (M = 68.5, SD = 7.2), and Arts &amp; Sciences (M = 61.0, SD = 7.0).</w:t>
+        <w:t>The One-Way ANOVA revealed statistically significant differences in academic stress levels across the four academic programs, F(3, 116) = 68.59, p &lt; .001. Therefore, the null hypothesis is Rejected. Engineering students exhibited the highest mean stress score (M = 83.5, SD = 7.8), followed by Computing &amp; IT (M = 76.0, SD = 7.5), Business &amp; Accountancy (M = 68.5, SD = 7.2), and Arts &amp; Sciences (M = 61.0, SD = 7.0).</w:t>
         <w:br/>
-        <w:t>Tukey's post-hoc test demonstrated that all pairwise comparisons are statistically significant (p &lt; .001), indicating that each academic program experiences a distinct level of academic stress.</w:t>
+        <w:t>Tukey's post-hoc tests demonstrated that every pairwise comparison is statistically significant (p &lt; .001), indicating that students in each program experience substantially distinct academic stress environments.</w:t>
       </w:r>
     </w:p>
     <w:p>
@@ -5970,19 +5961,12 @@
         </w:rPr>
         <w:t>Statement of the Problem:</w:t>
         <w:br/>
-        <w:t>How do Teaching Method and Prior Math Background simultaneously affect students' Statistics Exam Performance, and is there a significant interaction effect between the two factors?</w:t>
+        <w:t>How do Teaching Method and Prior Math Background simultaneously influence students' Statistics Exam Performance, and is there a significant interaction effect between the two factors?</w:t>
         <w:br/>
         <w:br/>
-        <w:t>Hypotheses:</w:t>
+        <w:t>Dataset Tab to Use: Prob4_TwoWay_ANOVA in Jamovi_Seatwork_Practice_Data.xlsx (N = 120: 3x2 factorial design)</w:t>
         <w:br/>
-        <w:t>• H₀(A): There is no significant main effect of Teaching Method on Statistics Exam Performance.</w:t>
-        <w:br/>
-        <w:t>• H₀(B): There is no significant main effect of Prior Math Background on Statistics Exam Performance.</w:t>
-        <w:br/>
-        <w:t>• H₀(AB): There is no significant interaction effect between Teaching Method and Prior Math Background.</w:t>
-        <w:br/>
-        <w:br/>
-        <w:t>Dataset Tab to Use: Prob4_TwoWay_ANOVA in Jamovi_Seatwork_Practice_Data.xlsx (N = 120: 3x2 factorial design, 20 per cell)</w:t>
+        <w:t>• Includes text labels: Teaching_Method ('Traditional Lecture', 'Blended Learning', 'Gamified Active Learning'), Math_Background ('Non-STEM', 'STEM'), and continuous Statistics_Exam_Score.</w:t>
       </w:r>
     </w:p>
     <w:p>
@@ -6009,24 +5993,22 @@
         <w:br/>
         <w:t>• In Jamovi, open sheet Prob4_TwoWay_ANOVA.</w:t>
         <w:br/>
-        <w:t>• Double-click Teaching_Method -&gt; Set Measure Type to Nominal (1 = Traditional Lecture, 2 = Blended Learning, 3 = Gamified Active Learning).</w:t>
+        <w:t>• Verify Teaching_Method and Math_Background are Nominal (with text labels).</w:t>
         <w:br/>
-        <w:t>• Double-click Math_Background -&gt; Set Measure Type to Nominal (1 = Non-STEM, 2 = STEM).</w:t>
-        <w:br/>
-        <w:t>• Double-click Statistics_Exam_Score -&gt; Set Measure Type to Continuous (123).</w:t>
+        <w:t>• Ensure Statistics_Exam_Score is set to Continuous (123).</w:t>
         <w:br/>
         <w:br/>
         <w:t>Step 2: Run Two-Way Factorial ANOVA</w:t>
         <w:br/>
-        <w:t>• Top menu: Analyses -&gt; ANOVA -&gt; ANOVA (not One-Way ANOVA).</w:t>
+        <w:t>• Top menu: Analyses -&gt; ANOVA -&gt; ANOVA.</w:t>
         <w:br/>
         <w:t>• Drag Statistics_Exam_Score into Dependent Variable.</w:t>
         <w:br/>
         <w:t>• Drag Teaching_Method and Math_Background into Fixed Factors.</w:t>
         <w:br/>
-        <w:t>• Click Post Hoc Tests dropdown -&gt; drag Teaching_Method, Math_Background, and the interaction term Teaching_Method * Math_Background into the right box.</w:t>
+        <w:t>• Expand Post Hoc Tests -&gt; drag Teaching_Method, Math_Background, and the interaction term into the right box.</w:t>
         <w:br/>
-        <w:t>• Click Estimated Marginal Means dropdown -&gt; drag Teaching_Method and Math_Background into the display box to generate the interaction plot.</w:t>
+        <w:t>• Expand Estimated Marginal Means -&gt; drag Teaching_Method and Math_Background into the display box to view the interaction plot chart.</w:t>
       </w:r>
     </w:p>
     <w:p>
@@ -6664,7 +6646,7 @@
                 <w:b/>
                 <w:color w:val="FFFFFF"/>
               </w:rPr>
-              <w:t>Teaching Method</w:t>
+              <w:t>Teaching Method (Text Label)</w:t>
             </w:r>
           </w:p>
         </w:tc>
@@ -6679,7 +6661,7 @@
                 <w:b/>
                 <w:color w:val="FFFFFF"/>
               </w:rPr>
-              <w:t>Non-STEM (1)</w:t>
+              <w:t>Non-STEM</w:t>
             </w:r>
           </w:p>
         </w:tc>
@@ -6694,7 +6676,7 @@
                 <w:b/>
                 <w:color w:val="FFFFFF"/>
               </w:rPr>
-              <w:t>STEM (2)</w:t>
+              <w:t>STEM</w:t>
             </w:r>
           </w:p>
         </w:tc>
@@ -6730,7 +6712,7 @@
               <w:rPr>
                 <w:sz w:val="18"/>
               </w:rPr>
-              <w:t>1 - Traditional Lecture</w:t>
+              <w:t>Traditional Lecture</w:t>
             </w:r>
           </w:p>
         </w:tc>
@@ -6810,7 +6792,7 @@
               <w:rPr>
                 <w:sz w:val="18"/>
               </w:rPr>
-              <w:t>2 - Blended Learning</w:t>
+              <w:t>Blended Learning</w:t>
             </w:r>
           </w:p>
         </w:tc>
@@ -6890,7 +6872,7 @@
               <w:rPr>
                 <w:sz w:val="18"/>
               </w:rPr>
-              <w:t>3 - Gamified Active Learning</w:t>
+              <w:t>Gamified Active Learning</w:t>
             </w:r>
           </w:p>
         </w:tc>
@@ -7049,11 +7031,11 @@
         </w:rPr>
         <w:t>Written Interpretation for Two-Way ANOVA:</w:t>
         <w:br/>
-        <w:t>1. Main Effect of Teaching Method: Highly significant, F(2, 114) = 112.45, p &lt; .001. Gamified Active Learning produced the highest overall performance (M = 85.5), followed by Blended Learning (M = 76.5) and Traditional Lecture (M = 68.0).</w:t>
+        <w:t>1. Main Effect of Teaching Method: Highly significant, F(2, 114) = 112.45, p &lt; .001. Gamified Active Learning produced the highest exam scores (M = 85.5), followed by Blended Learning (M = 76.5) and Traditional Lecture (M = 68.0).</w:t>
         <w:br/>
-        <w:t>2. Main Effect of Math Background: Highly significant, F(1, 114) = 48.32, p &lt; .001. STEM students scored higher on average (M = 81.0) than Non-STEM students (M = 72.3).</w:t>
+        <w:t>2. Main Effect of Math Background: Highly significant, F(1, 114) = 48.32, p &lt; .001. STEM students achieved higher scores (M = 81.0) than Non-STEM students (M = 72.3).</w:t>
         <w:br/>
-        <w:t>3. Interaction Effect: Statistically significant, F(2, 114) = 6.87, p = .001. While STEM students outperformed Non-STEM students across all methods, the performance gap was widest under Traditional Lecture (12.0 point gap) and smallest under Gamified Active Learning (only a 5.0 point gap). This indicates that Gamified Active Learning disproportionately benefits students with Non-STEM backgrounds.</w:t>
+        <w:t>3. Interaction Effect: Statistically significant, F(2, 114) = 6.87, p = .001. The performance difference between STEM and Non-STEM students was largest under Traditional Lecture (12.0 points) and smallest under Gamified Active Learning (only 5.0 points). This confirms that gamified instruction effectively closes the achievement gap for Non-STEM learners.</w:t>
       </w:r>
     </w:p>
     <w:p>
@@ -7082,6 +7064,8 @@
         <w:br/>
         <w:br/>
         <w:t>Dataset Tab to Use: Prob5_Descriptives_Variance in Jamovi_Seatwork_Practice_Data.xlsx (N = 80: 40 Section Alpha, 40 Section Beta)</w:t>
+        <w:br/>
+        <w:t>• Includes text labels: Section ('Section Alpha', 'Section Beta'), Teaching_Approach, and continuous Quiz_Score.</w:t>
       </w:r>
     </w:p>
     <w:p>
@@ -7104,28 +7088,28 @@
         <w:rPr>
           <w:sz w:val="19"/>
         </w:rPr>
-        <w:t>Step 1: Open Tab &amp; Set Variables</w:t>
+        <w:t>Step 1: Open Tab &amp; Select Variables</w:t>
         <w:br/>
         <w:t>• In Jamovi, open sheet Prob5_Descriptives_Variance.</w:t>
         <w:br/>
-        <w:t>• Double-click Section -&gt; Set Measure Type to Nominal (Levels: 1 = Section Alpha, 2 = Section Beta).</w:t>
+        <w:t>• Verify Section is Nominal with labels 'Section Alpha' and 'Section Beta'.</w:t>
         <w:br/>
-        <w:t>• Double-click Quiz_Score -&gt; Set Measure Type to Continuous (123).</w:t>
+        <w:t>• Ensure Quiz_Score is set to Continuous (123).</w:t>
         <w:br/>
         <w:br/>
         <w:t>Step 2: Run Exploration Descriptives Split by Section</w:t>
         <w:br/>
         <w:t>• Top menu: Analyses -&gt; Exploration -&gt; Descriptives.</w:t>
         <w:br/>
-        <w:t>• Drag Quiz_Score into Variables box.</w:t>
+        <w:t>• Move Quiz_Score into Variables box.</w:t>
         <w:br/>
-        <w:t>• Drag Section into Split by box.</w:t>
+        <w:t>• Move Section into Split by box.</w:t>
         <w:br/>
         <w:t>• Under Central Tendency: check Mean and Median.</w:t>
         <w:br/>
         <w:t>• Under Dispersion: check Variance, Std. deviation, IQR, Minimum, Maximum.</w:t>
         <w:br/>
-        <w:t>• Under Plots: check Box plot and Violin to visually inspect dispersion.</w:t>
+        <w:t>• Under Plots: check Box plot and Violin to visually compare dispersion.</w:t>
       </w:r>
     </w:p>
     <w:p>
@@ -7190,7 +7174,7 @@
                 <w:b/>
                 <w:color w:val="FFFFFF"/>
               </w:rPr>
-              <w:t>Section 1 (Alpha - Traditional)</w:t>
+              <w:t>Section Alpha (Traditional Study)</w:t>
             </w:r>
           </w:p>
         </w:tc>
@@ -7205,7 +7189,7 @@
                 <w:b/>
                 <w:color w:val="FFFFFF"/>
               </w:rPr>
-              <w:t>Section 2 (Beta - Peer Study)</w:t>
+              <w:t>Section Beta (Peer Study)</w:t>
             </w:r>
           </w:p>
         </w:tc>
@@ -7540,7 +7524,7 @@
                 <w:b/>
                 <w:sz w:val="18"/>
               </w:rPr>
-              <w:t>Section Beta has 6.3x smaller variance!</w:t>
+              <w:t>Section Beta has 6.3x lower variance!</w:t>
             </w:r>
           </w:p>
         </w:tc>
@@ -7796,7 +7780,7 @@
         </w:rPr>
         <w:t>Written Interpretation for Descriptives &amp; Variance:</w:t>
         <w:br/>
-        <w:t>While both cohorts achieved nearly identical mean scores (Section Alpha = 77.2 vs Section Beta = 78.4), Section Beta exhibited far superior consistency in academic performance. The variance of Section Alpha (s² = 163.3, SD = 12.8) is more than six times greater than that of Section Beta (s² = 26.0, SD = 5.1). Furthermore, the interquartile range of Section Beta (IQR = 7.0) is much narrower than Section Alpha (IQR = 18.2).</w:t>
+        <w:t>While both sections achieved comparable mean scores (Section Alpha = 77.2 vs Section Beta = 78.4), Section Beta exhibited far superior consistency in academic performance. The variance of Section Alpha (s² = 163.3, SD = 12.8) is more than six times greater than that of Section Beta (s² = 26.0, SD = 5.1). Furthermore, the interquartile range of Section Beta (IQR = 7.0) is much narrower than Section Alpha (IQR = 18.2).</w:t>
         <w:br/>
         <w:t>Conclusion: Section Beta (Peer Study) demonstrates significantly greater consistency, lower spread, and lower variability in quiz scores than Section Alpha (Traditional Study).</w:t>
       </w:r>

</xml_diff>